<commit_message>
Release V3 editor improvements
</commit_message>
<xml_diff>
--- a/使用和密钥注册教程.docx
+++ b/使用和密钥注册教程.docx
@@ -25,7 +25,7 @@
           <w:szCs w:val="36"/>
           <w:lang w:val="en-US" w:eastAsia="zh-CN"/>
         </w:rPr>
-        <w:t>密钥注册教程</w:t>
+        <w:t>密钥注册/软件使用教程</w:t>
       </w:r>
     </w:p>
     <w:p>
@@ -132,6 +132,8 @@
           <w:bCs w:val="0"/>
           <w:sz w:val="24"/>
           <w:szCs w:val="21"/>
+          <w:highlight w:val="yellow"/>
+          <w:u w:val="single"/>
           <w:lang w:val="en-US" w:eastAsia="zh-CN"/>
         </w:rPr>
       </w:pPr>
@@ -160,9 +162,26 @@
           <w:lang w:val="en-US" w:eastAsia="zh-CN"/>
         </w:rPr>
       </w:pPr>
+      <w:r>
+        <w:rPr>
+          <w:rFonts w:hint="eastAsia" w:ascii="MiSans VF Bold" w:hAnsi="MiSans VF Bold" w:eastAsia="MiSans VF Bold" w:cs="MiSans VF Bold"/>
+          <w:b w:val="0"/>
+          <w:bCs w:val="0"/>
+          <w:sz w:val="24"/>
+          <w:szCs w:val="21"/>
+          <w:highlight w:val="yellow"/>
+          <w:u w:val="single"/>
+          <w:lang w:val="en-US" w:eastAsia="zh-CN"/>
+        </w:rPr>
+        <w:t>密钥为第三方服务商runninghub，gpt2和banana2生成图片都是需要成本的，想要低成本使用，借助第三方是最佳选择，这边一张图0.1~0.19元，自己充值，用多少扣多少！</w:t>
+      </w:r>
     </w:p>
     <w:p>
       <w:pPr>
+        <w:pStyle w:val="4"/>
+        <w:keepNext w:val="0"/>
+        <w:pageBreakBefore w:val="0"/>
+        <w:spacing w:before="160" w:after="60"/>
         <w:rPr>
           <w:rFonts w:hint="eastAsia" w:ascii="MiSans VF Bold" w:hAnsi="MiSans VF Bold" w:eastAsia="MiSans VF Bold" w:cs="MiSans VF Bold"/>
           <w:b w:val="0"/>
@@ -185,16 +204,65 @@
           <w:u w:val="single"/>
           <w:lang w:val="en-US" w:eastAsia="zh-CN"/>
         </w:rPr>
-        <w:t>密钥为第三方服务商runninghub，gpt2和banana2生成图片都是需要成本的，想要低成本使用，借助第三方是最佳选择，这边一张图0.1~0.19元，自己充值，用多少扣多少，我没有任何费用能赚取！</w:t>
+        <w:t>不喜欢可以去其他各种生图平台充积分开会员自己去用！最后嘴下留情！</w:t>
       </w:r>
     </w:p>
     <w:p>
       <w:pPr>
+        <w:spacing w:before="0" w:after="120" w:line="276" w:lineRule="auto"/>
         <w:rPr>
-          <w:rFonts w:hint="eastAsia"/>
+          <w:rFonts w:hint="default" w:ascii="MiSans VF Bold" w:hAnsi="MiSans VF Bold" w:eastAsia="MiSans VF Bold" w:cs="MiSans VF Bold"/>
+          <w:b w:val="0"/>
+          <w:bCs w:val="0"/>
+          <w:sz w:val="24"/>
+          <w:szCs w:val="21"/>
+          <w:highlight w:val="yellow"/>
+          <w:u w:val="single"/>
           <w:lang w:val="en-US" w:eastAsia="zh-CN"/>
         </w:rPr>
       </w:pPr>
+      <w:r>
+        <w:rPr>
+          <w:rFonts w:hint="eastAsia" w:ascii="MiSans VF Bold" w:hAnsi="MiSans VF Bold" w:eastAsia="MiSans VF Bold" w:cs="MiSans VF Bold"/>
+          <w:b w:val="0"/>
+          <w:bCs w:val="0"/>
+          <w:sz w:val="24"/>
+          <w:szCs w:val="21"/>
+          <w:highlight w:val="red"/>
+          <w:u w:val="single"/>
+          <w:lang w:val="en-US" w:eastAsia="zh-CN"/>
+        </w:rPr>
+        <w:t>目前runinghub于7月底将迁移至海外版</w:t>
+      </w:r>
+      <w:r>
+        <w:fldChar w:fldCharType="begin"/>
+      </w:r>
+      <w:r>
+        <w:instrText xml:space="preserve"> HYPERLINK "https://www.runninghub.ai?inviteCode=wtfdbtbd" \h </w:instrText>
+      </w:r>
+      <w:r>
+        <w:fldChar w:fldCharType="separate"/>
+      </w:r>
+      <w:r>
+        <w:rPr>
+          <w:rFonts w:ascii="Arial" w:hAnsi="Arial" w:eastAsia="Arial"/>
+          <w:b/>
+          <w:color w:val="0563C1"/>
+          <w:sz w:val="28"/>
+          <w:u w:val="single"/>
+        </w:rPr>
+        <w:t>https://www.runninghub.ai?inviteCode=wtfdbtbd</w:t>
+      </w:r>
+      <w:r>
+        <w:rPr>
+          <w:rFonts w:ascii="Arial" w:hAnsi="Arial" w:eastAsia="Arial"/>
+          <w:b/>
+          <w:color w:val="0563C1"/>
+          <w:sz w:val="28"/>
+          <w:u w:val="single"/>
+        </w:rPr>
+        <w:fldChar w:fldCharType="end"/>
+      </w:r>
       <w:r>
         <w:rPr>
           <w:rFonts w:hint="eastAsia" w:ascii="MiSans VF Bold" w:hAnsi="MiSans VF Bold" w:eastAsia="MiSans VF Bold" w:cs="MiSans VF Bold"/>
@@ -206,10 +274,8 @@
           <w:u w:val="single"/>
           <w:lang w:val="en-US" w:eastAsia="zh-CN"/>
         </w:rPr>
-        <w:t>不喜欢可以去其他各种生图平台充积分开会员自己去用！最后嘴下留情！</w:t>
+        <w:t>联系客服迁移账户or重新注册</w:t>
       </w:r>
-      <w:bookmarkStart w:id="0" w:name="_GoBack"/>
-      <w:bookmarkEnd w:id="0"/>
     </w:p>
     <w:p>
       <w:pPr>
@@ -234,8 +300,8 @@
       <w:r>
         <w:drawing>
           <wp:inline distT="0" distB="0" distL="114300" distR="114300">
-            <wp:extent cx="6268085" cy="3945890"/>
-            <wp:effectExtent l="0" t="0" r="10795" b="1270"/>
+            <wp:extent cx="6071870" cy="3822700"/>
+            <wp:effectExtent l="0" t="0" r="8890" b="2540"/>
             <wp:docPr id="7" name="图片 2"/>
             <wp:cNvGraphicFramePr>
               <a:graphicFrameLocks xmlns:a="http://schemas.openxmlformats.org/drawingml/2006/main" noChangeAspect="1"/>
@@ -258,7 +324,7 @@
                   <pic:spPr>
                     <a:xfrm>
                       <a:off x="0" y="0"/>
-                      <a:ext cx="6268085" cy="3945890"/>
+                      <a:ext cx="6071870" cy="3822700"/>
                     </a:xfrm>
                     <a:prstGeom prst="rect">
                       <a:avLst/>
@@ -274,16 +340,6 @@
           </wp:inline>
         </w:drawing>
       </w:r>
-    </w:p>
-    <w:p>
-      <w:pPr>
-        <w:spacing w:before="0" w:after="200" w:line="276" w:lineRule="auto"/>
-      </w:pPr>
-    </w:p>
-    <w:p>
-      <w:pPr>
-        <w:spacing w:before="0" w:after="200" w:line="276" w:lineRule="auto"/>
-      </w:pPr>
     </w:p>
     <w:p>
       <w:pPr>
@@ -327,7 +383,7 @@
         <w:fldChar w:fldCharType="begin"/>
       </w:r>
       <w:r>
-        <w:instrText xml:space="preserve"> HYPERLINK "https://www.runninghub.cn/?inviteCode=1bcdcd69" \h </w:instrText>
+        <w:instrText xml:space="preserve"> HYPERLINK "https://www.runninghub.ai?inviteCode=wtfdbtbd" \h </w:instrText>
       </w:r>
       <w:r>
         <w:fldChar w:fldCharType="separate"/>
@@ -340,7 +396,7 @@
           <w:sz w:val="28"/>
           <w:u w:val="single"/>
         </w:rPr>
-        <w:t>https://www.runninghub.cn/?inviteCode=1bcdcd69</w:t>
+        <w:t>https://www.runninghub.ai?inviteCode=wtfdbtbd</w:t>
       </w:r>
       <w:r>
         <w:rPr>
@@ -530,6 +586,19 @@
     </w:p>
     <w:p>
       <w:pPr>
+        <w:rPr>
+          <w:rFonts w:hint="eastAsia" w:ascii="MiSans VF Demibold" w:hAnsi="MiSans VF Demibold" w:eastAsia="MiSans VF Demibold" w:cs="MiSans VF Demibold"/>
+        </w:rPr>
+      </w:pPr>
+      <w:r>
+        <w:rPr>
+          <w:rFonts w:hint="eastAsia" w:ascii="MiSans VF Demibold" w:hAnsi="MiSans VF Demibold" w:eastAsia="MiSans VF Demibold" w:cs="MiSans VF Demibold"/>
+        </w:rPr>
+        <w:br w:type="page"/>
+      </w:r>
+    </w:p>
+    <w:p>
+      <w:pPr>
         <w:pStyle w:val="4"/>
         <w:keepNext w:val="0"/>
         <w:pageBreakBefore w:val="0"/>
@@ -664,8 +733,8 @@
       <w:r>
         <w:drawing>
           <wp:inline distT="0" distB="0" distL="114300" distR="114300">
-            <wp:extent cx="5074920" cy="2343150"/>
-            <wp:effectExtent l="0" t="0" r="0" b="3810"/>
+            <wp:extent cx="5798185" cy="2677160"/>
+            <wp:effectExtent l="0" t="0" r="8255" b="5080"/>
             <wp:docPr id="3" name="Picture 3"/>
             <wp:cNvGraphicFramePr>
               <a:graphicFrameLocks xmlns:a="http://schemas.openxmlformats.org/drawingml/2006/main" noChangeAspect="1"/>
@@ -688,7 +757,7 @@
                   <pic:spPr>
                     <a:xfrm>
                       <a:off x="0" y="0"/>
-                      <a:ext cx="5074920" cy="2343419"/>
+                      <a:ext cx="5798185" cy="2677160"/>
                     </a:xfrm>
                     <a:prstGeom prst="rect">
                       <a:avLst/>
@@ -703,9 +772,138 @@
     </w:p>
     <w:p>
       <w:pPr>
-        <w:jc w:val="center"/>
+        <w:rPr>
+          <w:rFonts w:hint="eastAsia" w:ascii="MiSans VF Demibold" w:hAnsi="MiSans VF Demibold" w:eastAsia="MiSans VF Demibold" w:cs="MiSans VF Demibold"/>
+        </w:rPr>
+      </w:pPr>
+      <w:r>
         <w:rPr>
           <w:rFonts w:hint="eastAsia"/>
+        </w:rPr>
+        <w:br w:type="page"/>
+      </w:r>
+    </w:p>
+    <w:p>
+      <w:pPr>
+        <w:pStyle w:val="4"/>
+        <w:keepNext w:val="0"/>
+        <w:pageBreakBefore w:val="0"/>
+        <w:spacing w:before="160" w:after="60"/>
+        <w:rPr>
+          <w:rFonts w:hint="eastAsia" w:ascii="MiSans VF Demibold" w:hAnsi="MiSans VF Demibold" w:eastAsia="MiSans VF Demibold" w:cs="MiSans VF Demibold"/>
+          <w:lang w:val="en-US" w:eastAsia="zh-CN"/>
+        </w:rPr>
+      </w:pPr>
+      <w:r>
+        <w:rPr>
+          <w:rFonts w:hint="eastAsia" w:ascii="MiSans VF Demibold" w:hAnsi="MiSans VF Demibold" w:eastAsia="MiSans VF Demibold" w:cs="MiSans VF Demibold"/>
+        </w:rPr>
+        <w:t>第 4 步：</w:t>
+      </w:r>
+      <w:r>
+        <w:rPr>
+          <w:rFonts w:hint="eastAsia" w:ascii="MiSans VF Demibold" w:hAnsi="MiSans VF Demibold" w:eastAsia="MiSans VF Demibold" w:cs="MiSans VF Demibold"/>
+          <w:lang w:val="en-US" w:eastAsia="zh-CN"/>
+        </w:rPr>
+        <w:t>填入软件中保存</w:t>
+      </w:r>
+    </w:p>
+    <w:p>
+      <w:r>
+        <w:drawing>
+          <wp:inline distT="0" distB="0" distL="114300" distR="114300">
+            <wp:extent cx="6260465" cy="3949700"/>
+            <wp:effectExtent l="0" t="0" r="3175" b="12700"/>
+            <wp:docPr id="11" name="图片 4"/>
+            <wp:cNvGraphicFramePr>
+              <a:graphicFrameLocks xmlns:a="http://schemas.openxmlformats.org/drawingml/2006/main" noChangeAspect="1"/>
+            </wp:cNvGraphicFramePr>
+            <a:graphic xmlns:a="http://schemas.openxmlformats.org/drawingml/2006/main">
+              <a:graphicData uri="http://schemas.openxmlformats.org/drawingml/2006/picture">
+                <pic:pic xmlns:pic="http://schemas.openxmlformats.org/drawingml/2006/picture">
+                  <pic:nvPicPr>
+                    <pic:cNvPr id="11" name="图片 4"/>
+                    <pic:cNvPicPr>
+                      <a:picLocks noChangeAspect="1"/>
+                    </pic:cNvPicPr>
+                  </pic:nvPicPr>
+                  <pic:blipFill>
+                    <a:blip r:embed="rId10"/>
+                    <a:stretch>
+                      <a:fillRect/>
+                    </a:stretch>
+                  </pic:blipFill>
+                  <pic:spPr>
+                    <a:xfrm>
+                      <a:off x="0" y="0"/>
+                      <a:ext cx="6260465" cy="3949700"/>
+                    </a:xfrm>
+                    <a:prstGeom prst="rect">
+                      <a:avLst/>
+                    </a:prstGeom>
+                    <a:noFill/>
+                    <a:ln>
+                      <a:noFill/>
+                    </a:ln>
+                  </pic:spPr>
+                </pic:pic>
+              </a:graphicData>
+            </a:graphic>
+          </wp:inline>
+        </w:drawing>
+      </w:r>
+    </w:p>
+    <w:p>
+      <w:pPr>
+        <w:spacing w:before="0" w:after="100" w:line="276" w:lineRule="auto"/>
+        <w:rPr>
+          <w:rFonts w:hint="eastAsia" w:ascii="MiSans VF Light" w:hAnsi="MiSans VF Light" w:eastAsia="MiSans VF Light" w:cs="MiSans VF Light"/>
+          <w:lang w:val="en-US" w:eastAsia="zh-CN"/>
+        </w:rPr>
+      </w:pPr>
+      <w:r>
+        <w:rPr>
+          <w:rFonts w:hint="eastAsia" w:ascii="MiSans VF Light" w:hAnsi="MiSans VF Light" w:eastAsia="MiSans VF Light" w:cs="MiSans VF Light"/>
+          <w:lang w:val="en-US" w:eastAsia="zh-CN"/>
+        </w:rPr>
+        <w:t>把密钥拿回来</w:t>
+      </w:r>
+      <w:r>
+        <w:rPr>
+          <w:rFonts w:hint="eastAsia" w:ascii="MiSans VF Light" w:hAnsi="MiSans VF Light" w:eastAsia="MiSans VF Light" w:cs="MiSans VF Light"/>
+        </w:rPr>
+        <w:t>，</w:t>
+      </w:r>
+      <w:r>
+        <w:rPr>
+          <w:rFonts w:hint="eastAsia" w:ascii="MiSans VF Light" w:hAnsi="MiSans VF Light" w:eastAsia="MiSans VF Light" w:cs="MiSans VF Light"/>
+          <w:lang w:val="en-US" w:eastAsia="zh-CN"/>
+        </w:rPr>
+        <w:t>复制粘贴到API Key里面后，右上角点击</w:t>
+      </w:r>
+      <w:r>
+        <w:rPr>
+          <w:rFonts w:hint="eastAsia" w:ascii="MiSans VF Bold" w:hAnsi="MiSans VF Bold" w:eastAsia="MiSans VF Bold" w:cs="MiSans VF Bold"/>
+          <w:b/>
+          <w:bCs/>
+          <w:lang w:val="en-US" w:eastAsia="zh-CN"/>
+        </w:rPr>
+        <w:t>保存设置</w:t>
+      </w:r>
+      <w:r>
+        <w:rPr>
+          <w:rFonts w:hint="eastAsia" w:ascii="MiSans VF Light" w:hAnsi="MiSans VF Light" w:eastAsia="MiSans VF Light" w:cs="MiSans VF Light"/>
+          <w:lang w:val="en-US" w:eastAsia="zh-CN"/>
+        </w:rPr>
+        <w:t>即可。</w:t>
+      </w:r>
+    </w:p>
+    <w:p>
+      <w:pPr>
+        <w:spacing w:before="0" w:after="100" w:line="276" w:lineRule="auto"/>
+        <w:rPr>
+          <w:rFonts w:hint="default" w:ascii="MiSans VF Light" w:hAnsi="MiSans VF Light" w:eastAsia="MiSans VF Light" w:cs="MiSans VF Light"/>
+          <w:lang w:val="en-US" w:eastAsia="zh-CN"/>
         </w:rPr>
       </w:pPr>
     </w:p>
@@ -715,6 +913,110 @@
         <w:keepNext w:val="0"/>
         <w:pageBreakBefore w:val="0"/>
         <w:spacing w:before="160" w:after="60"/>
+        <w:rPr>
+          <w:rFonts w:hint="eastAsia" w:ascii="MiSans VF Demibold" w:hAnsi="MiSans VF Demibold" w:eastAsia="MiSans VF Demibold" w:cs="MiSans VF Demibold"/>
+          <w:color w:val="000000" w:themeColor="text1"/>
+          <w:highlight w:val="yellow"/>
+          <w:lang w:val="en-US" w:eastAsia="zh-CN"/>
+          <w14:textFill>
+            <w14:solidFill>
+              <w14:schemeClr w14:val="tx1"/>
+            </w14:solidFill>
+          </w14:textFill>
+        </w:rPr>
+      </w:pPr>
+      <w:r>
+        <w:rPr>
+          <w:rFonts w:hint="eastAsia" w:ascii="MiSans VF Demibold" w:hAnsi="MiSans VF Demibold" w:eastAsia="MiSans VF Demibold" w:cs="MiSans VF Demibold"/>
+          <w:color w:val="000000" w:themeColor="text1"/>
+          <w:highlight w:val="yellow"/>
+          <w:lang w:val="en-US" w:eastAsia="zh-CN"/>
+          <w14:textFill>
+            <w14:solidFill>
+              <w14:schemeClr w14:val="tx1"/>
+            </w14:solidFill>
+          </w14:textFill>
+        </w:rPr>
+        <w:t>目前runinghub于7月底将迁移至海外版，需要重新注册账户</w:t>
+      </w:r>
+    </w:p>
+    <w:p>
+      <w:pPr>
+        <w:spacing w:before="0" w:after="120" w:line="276" w:lineRule="auto"/>
+        <w:rPr>
+          <w:rFonts w:hint="default"/>
+          <w:lang w:val="en-US" w:eastAsia="zh-CN"/>
+        </w:rPr>
+      </w:pPr>
+      <w:r>
+        <w:fldChar w:fldCharType="begin"/>
+      </w:r>
+      <w:r>
+        <w:instrText xml:space="preserve"> HYPERLINK "https://www.runninghub.ai?inviteCode=wtfdbtbd" \h </w:instrText>
+      </w:r>
+      <w:r>
+        <w:fldChar w:fldCharType="separate"/>
+      </w:r>
+      <w:r>
+        <w:rPr>
+          <w:rFonts w:ascii="Arial" w:hAnsi="Arial" w:eastAsia="Arial"/>
+          <w:b/>
+          <w:color w:val="0563C1"/>
+          <w:sz w:val="28"/>
+          <w:u w:val="single"/>
+        </w:rPr>
+        <w:t>https://www.runninghub.ai?inviteCode=wtfdbtbd</w:t>
+      </w:r>
+      <w:r>
+        <w:rPr>
+          <w:rFonts w:ascii="Arial" w:hAnsi="Arial" w:eastAsia="Arial"/>
+          <w:b/>
+          <w:color w:val="0563C1"/>
+          <w:sz w:val="28"/>
+          <w:u w:val="single"/>
+        </w:rPr>
+        <w:fldChar w:fldCharType="end"/>
+      </w:r>
+    </w:p>
+    <w:p>
+      <w:pPr>
+        <w:rPr>
+          <w:rFonts w:hint="default"/>
+          <w:lang w:val="en-US" w:eastAsia="zh-CN"/>
+        </w:rPr>
+      </w:pPr>
+      <w:r>
+        <w:rPr>
+          <w:rFonts w:hint="eastAsia" w:ascii="MiSans VF Demibold" w:hAnsi="MiSans VF Demibold" w:eastAsia="MiSans VF Demibold" w:cs="MiSans VF Demibold"/>
+          <w:color w:val="000000" w:themeColor="text1"/>
+          <w:highlight w:val="yellow"/>
+          <w:lang w:val="en-US" w:eastAsia="zh-CN"/>
+          <w14:textFill>
+            <w14:solidFill>
+              <w14:schemeClr w14:val="tx1"/>
+            </w14:solidFill>
+          </w14:textFill>
+        </w:rPr>
+        <w:t>（国内禁止明面使用海外模型banana/gpt之类模型，所以全部以美元计费）</w:t>
+      </w:r>
+    </w:p>
+    <w:p>
+      <w:pPr>
+        <w:rPr>
+          <w:rFonts w:hint="eastAsia" w:ascii="MiSans VF Demibold" w:hAnsi="MiSans VF Demibold" w:eastAsia="MiSans VF Demibold" w:cs="MiSans VF Demibold"/>
+        </w:rPr>
+      </w:pPr>
+      <w:r>
+        <w:rPr>
+          <w:rFonts w:hint="eastAsia" w:ascii="MiSans VF Demibold" w:hAnsi="MiSans VF Demibold" w:eastAsia="MiSans VF Demibold" w:cs="MiSans VF Demibold"/>
+        </w:rPr>
+        <w:br w:type="page"/>
+      </w:r>
+      <w:bookmarkStart w:id="0" w:name="_GoBack"/>
+      <w:bookmarkEnd w:id="0"/>
+    </w:p>
+    <w:p>
+      <w:pPr>
         <w:rPr>
           <w:rFonts w:hint="eastAsia" w:ascii="MiSans VF Demibold" w:hAnsi="MiSans VF Demibold" w:eastAsia="MiSans VF Demibold" w:cs="MiSans VF Demibold"/>
         </w:rPr>
@@ -734,7 +1036,20 @@
         <w:rPr>
           <w:rFonts w:hint="eastAsia" w:ascii="MiSans VF Demibold" w:hAnsi="MiSans VF Demibold" w:eastAsia="MiSans VF Demibold" w:cs="MiSans VF Demibold"/>
         </w:rPr>
-        <w:t>第 4 步：查看余额和充值</w:t>
+        <w:t xml:space="preserve">第 </w:t>
+      </w:r>
+      <w:r>
+        <w:rPr>
+          <w:rFonts w:hint="eastAsia" w:ascii="MiSans VF Demibold" w:hAnsi="MiSans VF Demibold" w:eastAsia="MiSans VF Demibold" w:cs="MiSans VF Demibold"/>
+          <w:lang w:val="en-US" w:eastAsia="zh-CN"/>
+        </w:rPr>
+        <w:t>5</w:t>
+      </w:r>
+      <w:r>
+        <w:rPr>
+          <w:rFonts w:hint="eastAsia" w:ascii="MiSans VF Demibold" w:hAnsi="MiSans VF Demibold" w:eastAsia="MiSans VF Demibold" w:cs="MiSans VF Demibold"/>
+        </w:rPr>
+        <w:t xml:space="preserve"> 步：查看余额和充值</w:t>
       </w:r>
     </w:p>
     <w:p>
@@ -774,7 +1089,7 @@
                     </pic:cNvPicPr>
                   </pic:nvPicPr>
                   <pic:blipFill>
-                    <a:blip r:embed="rId10"/>
+                    <a:blip r:embed="rId11"/>
                     <a:stretch>
                       <a:fillRect/>
                     </a:stretch>
@@ -795,7 +1110,120 @@
         </w:drawing>
       </w:r>
     </w:p>
-    <w:p/>
+    <w:p>
+      <w:pPr>
+        <w:jc w:val="center"/>
+      </w:pPr>
+      <w:r>
+        <w:drawing>
+          <wp:inline distT="0" distB="0" distL="114300" distR="114300">
+            <wp:extent cx="5370195" cy="3362960"/>
+            <wp:effectExtent l="0" t="0" r="9525" b="5080"/>
+            <wp:docPr id="9" name="图片 2"/>
+            <wp:cNvGraphicFramePr>
+              <a:graphicFrameLocks xmlns:a="http://schemas.openxmlformats.org/drawingml/2006/main" noChangeAspect="1"/>
+            </wp:cNvGraphicFramePr>
+            <a:graphic xmlns:a="http://schemas.openxmlformats.org/drawingml/2006/main">
+              <a:graphicData uri="http://schemas.openxmlformats.org/drawingml/2006/picture">
+                <pic:pic xmlns:pic="http://schemas.openxmlformats.org/drawingml/2006/picture">
+                  <pic:nvPicPr>
+                    <pic:cNvPr id="9" name="图片 2"/>
+                    <pic:cNvPicPr>
+                      <a:picLocks noChangeAspect="1"/>
+                    </pic:cNvPicPr>
+                  </pic:nvPicPr>
+                  <pic:blipFill>
+                    <a:blip r:embed="rId12"/>
+                    <a:stretch>
+                      <a:fillRect/>
+                    </a:stretch>
+                  </pic:blipFill>
+                  <pic:spPr>
+                    <a:xfrm>
+                      <a:off x="0" y="0"/>
+                      <a:ext cx="5370195" cy="3362960"/>
+                    </a:xfrm>
+                    <a:prstGeom prst="rect">
+                      <a:avLst/>
+                    </a:prstGeom>
+                    <a:noFill/>
+                    <a:ln>
+                      <a:noFill/>
+                    </a:ln>
+                  </pic:spPr>
+                </pic:pic>
+              </a:graphicData>
+            </a:graphic>
+          </wp:inline>
+        </w:drawing>
+      </w:r>
+    </w:p>
+    <w:p>
+      <w:pPr>
+        <w:pStyle w:val="4"/>
+        <w:keepNext w:val="0"/>
+        <w:pageBreakBefore w:val="0"/>
+        <w:spacing w:before="160" w:after="60"/>
+        <w:rPr>
+          <w:rFonts w:hint="eastAsia" w:ascii="MiSans VF Demibold" w:hAnsi="MiSans VF Demibold" w:eastAsia="MiSans VF Demibold" w:cs="MiSans VF Demibold"/>
+          <w:color w:val="000000" w:themeColor="text1"/>
+          <w:highlight w:val="yellow"/>
+          <w:lang w:val="en-US" w:eastAsia="zh-CN"/>
+          <w14:textFill>
+            <w14:solidFill>
+              <w14:schemeClr w14:val="tx1"/>
+            </w14:solidFill>
+          </w14:textFill>
+        </w:rPr>
+      </w:pPr>
+      <w:r>
+        <w:rPr>
+          <w:rFonts w:hint="eastAsia" w:ascii="MiSans VF Demibold" w:hAnsi="MiSans VF Demibold" w:eastAsia="MiSans VF Demibold" w:cs="MiSans VF Demibold"/>
+          <w:color w:val="000000" w:themeColor="text1"/>
+          <w:highlight w:val="yellow"/>
+          <w:lang w:val="en-US" w:eastAsia="zh-CN"/>
+          <w14:textFill>
+            <w14:solidFill>
+              <w14:schemeClr w14:val="tx1"/>
+            </w14:solidFill>
+          </w14:textFill>
+        </w:rPr>
+        <w:t>目前runinghub于7月底将迁移至海外版</w:t>
+      </w:r>
+    </w:p>
+    <w:p>
+      <w:pPr>
+        <w:pStyle w:val="4"/>
+        <w:keepNext w:val="0"/>
+        <w:pageBreakBefore w:val="0"/>
+        <w:spacing w:before="160" w:after="60"/>
+        <w:rPr>
+          <w:rFonts w:hint="default" w:ascii="MiSans VF Demibold" w:hAnsi="MiSans VF Demibold" w:eastAsia="MiSans VF Demibold" w:cs="MiSans VF Demibold"/>
+          <w:color w:val="000000" w:themeColor="text1"/>
+          <w:highlight w:val="yellow"/>
+          <w:lang w:val="en-US" w:eastAsia="zh-CN"/>
+          <w14:textFill>
+            <w14:solidFill>
+              <w14:schemeClr w14:val="tx1"/>
+            </w14:solidFill>
+          </w14:textFill>
+        </w:rPr>
+      </w:pPr>
+      <w:r>
+        <w:rPr>
+          <w:rFonts w:hint="eastAsia" w:ascii="MiSans VF Demibold" w:hAnsi="MiSans VF Demibold" w:eastAsia="MiSans VF Demibold" w:cs="MiSans VF Demibold"/>
+          <w:color w:val="000000" w:themeColor="text1"/>
+          <w:highlight w:val="yellow"/>
+          <w:lang w:val="en-US" w:eastAsia="zh-CN"/>
+          <w14:textFill>
+            <w14:solidFill>
+              <w14:schemeClr w14:val="tx1"/>
+            </w14:solidFill>
+          </w14:textFill>
+        </w:rPr>
+        <w:t>（国内禁止明面使用海外模型banana/gpt之类模型，所以全部以美元计费）</w:t>
+      </w:r>
+    </w:p>
     <w:p>
       <w:pPr>
         <w:pStyle w:val="4"/>
@@ -820,10 +1248,13 @@
     </w:p>
     <w:p>
       <w:pPr>
-        <w:pStyle w:val="4"/>
-        <w:keepNext w:val="0"/>
-        <w:pageBreakBefore w:val="0"/>
-        <w:spacing w:before="160" w:after="60"/>
+        <w:rPr>
+          <w:rFonts w:hint="eastAsia" w:ascii="MiSans VF Demibold" w:hAnsi="MiSans VF Demibold" w:eastAsia="MiSans VF Demibold" w:cs="MiSans VF Demibold"/>
+        </w:rPr>
+      </w:pPr>
+    </w:p>
+    <w:p>
+      <w:pPr>
         <w:rPr>
           <w:rFonts w:hint="eastAsia" w:ascii="MiSans VF Demibold" w:hAnsi="MiSans VF Demibold" w:eastAsia="MiSans VF Demibold" w:cs="MiSans VF Demibold"/>
         </w:rPr>
@@ -857,19 +1288,36 @@
         <w:rPr>
           <w:rFonts w:hint="eastAsia" w:ascii="MiSans VF Light" w:hAnsi="MiSans VF Light" w:eastAsia="MiSans VF Light" w:cs="MiSans VF Light"/>
         </w:rPr>
-        <w:t>如果需要查看跑图进度、成功失败状态或图片状态，回到 RunningHub 控制台查看。</w:t>
+        <w:t>如果需要查看跑图进度、成功失败状态或图片状态，回到 RunningHub</w:t>
+      </w:r>
+      <w:r>
+        <w:rPr>
+          <w:rFonts w:hint="eastAsia" w:ascii="MiSans VF Light" w:hAnsi="MiSans VF Light" w:eastAsia="MiSans VF Light" w:cs="MiSans VF Light"/>
+          <w:lang w:val="en-US" w:eastAsia="zh-CN"/>
+        </w:rPr>
+        <w:t>个人头像</w:t>
+      </w:r>
+      <w:r>
+        <w:rPr>
+          <w:rFonts w:hint="eastAsia" w:ascii="MiSans VF Light" w:hAnsi="MiSans VF Light" w:eastAsia="MiSans VF Light" w:cs="MiSans VF Light"/>
+        </w:rPr>
+        <w:t xml:space="preserve"> 控制台查看。</w:t>
       </w:r>
     </w:p>
     <w:p>
       <w:pPr>
-        <w:jc w:val="center"/>
+        <w:spacing w:before="0" w:after="100" w:line="276" w:lineRule="auto"/>
+        <w:rPr>
+          <w:rFonts w:hint="eastAsia"/>
+          <w:lang w:eastAsia="zh-CN"/>
+        </w:rPr>
       </w:pPr>
       <w:r>
         <w:drawing>
           <wp:inline distT="0" distB="0" distL="114300" distR="114300">
-            <wp:extent cx="5074920" cy="3349625"/>
-            <wp:effectExtent l="0" t="0" r="0" b="3175"/>
-            <wp:docPr id="5" name="Picture 5"/>
+            <wp:extent cx="6254115" cy="2864485"/>
+            <wp:effectExtent l="0" t="0" r="9525" b="635"/>
+            <wp:docPr id="8" name="图片 1"/>
             <wp:cNvGraphicFramePr>
               <a:graphicFrameLocks xmlns:a="http://schemas.openxmlformats.org/drawingml/2006/main" noChangeAspect="1"/>
             </wp:cNvGraphicFramePr>
@@ -877,13 +1325,13 @@
               <a:graphicData uri="http://schemas.openxmlformats.org/drawingml/2006/picture">
                 <pic:pic xmlns:pic="http://schemas.openxmlformats.org/drawingml/2006/picture">
                   <pic:nvPicPr>
-                    <pic:cNvPr id="5" name="Picture 5"/>
+                    <pic:cNvPr id="8" name="图片 1"/>
                     <pic:cNvPicPr>
                       <a:picLocks noChangeAspect="1"/>
                     </pic:cNvPicPr>
                   </pic:nvPicPr>
                   <pic:blipFill>
-                    <a:blip r:embed="rId11"/>
+                    <a:blip r:embed="rId13"/>
                     <a:stretch>
                       <a:fillRect/>
                     </a:stretch>
@@ -891,11 +1339,15 @@
                   <pic:spPr>
                     <a:xfrm>
                       <a:off x="0" y="0"/>
-                      <a:ext cx="5074920" cy="3349735"/>
+                      <a:ext cx="6254115" cy="2864485"/>
                     </a:xfrm>
                     <a:prstGeom prst="rect">
                       <a:avLst/>
                     </a:prstGeom>
+                    <a:noFill/>
+                    <a:ln>
+                      <a:noFill/>
+                    </a:ln>
                   </pic:spPr>
                 </pic:pic>
               </a:graphicData>
@@ -903,6 +1355,63 @@
           </wp:inline>
         </w:drawing>
       </w:r>
+    </w:p>
+    <w:p>
+      <w:pPr>
+        <w:spacing w:before="0" w:after="100" w:line="276" w:lineRule="auto"/>
+        <w:rPr>
+          <w:rFonts w:hint="eastAsia" w:ascii="MiSans VF Light" w:hAnsi="MiSans VF Light" w:eastAsia="MiSans VF Light" w:cs="MiSans VF Light"/>
+          <w:lang w:eastAsia="zh-CN"/>
+        </w:rPr>
+      </w:pPr>
+      <w:r>
+        <w:drawing>
+          <wp:inline distT="0" distB="0" distL="114300" distR="114300">
+            <wp:extent cx="6268085" cy="3332480"/>
+            <wp:effectExtent l="0" t="0" r="10795" b="5080"/>
+            <wp:docPr id="10" name="图片 3"/>
+            <wp:cNvGraphicFramePr>
+              <a:graphicFrameLocks xmlns:a="http://schemas.openxmlformats.org/drawingml/2006/main" noChangeAspect="1"/>
+            </wp:cNvGraphicFramePr>
+            <a:graphic xmlns:a="http://schemas.openxmlformats.org/drawingml/2006/main">
+              <a:graphicData uri="http://schemas.openxmlformats.org/drawingml/2006/picture">
+                <pic:pic xmlns:pic="http://schemas.openxmlformats.org/drawingml/2006/picture">
+                  <pic:nvPicPr>
+                    <pic:cNvPr id="10" name="图片 3"/>
+                    <pic:cNvPicPr>
+                      <a:picLocks noChangeAspect="1"/>
+                    </pic:cNvPicPr>
+                  </pic:nvPicPr>
+                  <pic:blipFill>
+                    <a:blip r:embed="rId14"/>
+                    <a:stretch>
+                      <a:fillRect/>
+                    </a:stretch>
+                  </pic:blipFill>
+                  <pic:spPr>
+                    <a:xfrm>
+                      <a:off x="0" y="0"/>
+                      <a:ext cx="6268085" cy="3332480"/>
+                    </a:xfrm>
+                    <a:prstGeom prst="rect">
+                      <a:avLst/>
+                    </a:prstGeom>
+                    <a:noFill/>
+                    <a:ln>
+                      <a:noFill/>
+                    </a:ln>
+                  </pic:spPr>
+                </pic:pic>
+              </a:graphicData>
+            </a:graphic>
+          </wp:inline>
+        </w:drawing>
+      </w:r>
+    </w:p>
+    <w:p>
+      <w:pPr>
+        <w:jc w:val="both"/>
+      </w:pPr>
     </w:p>
     <w:p/>
     <w:sectPr>
@@ -1147,8 +1656,8 @@
     <w:lsdException w:uiPriority="99" w:name="Normal Indent"/>
     <w:lsdException w:uiPriority="99" w:name="footnote text"/>
     <w:lsdException w:uiPriority="99" w:name="annotation text"/>
-    <w:lsdException w:uiPriority="99" w:semiHidden="0" w:name="header"/>
-    <w:lsdException w:uiPriority="99" w:semiHidden="0" w:name="footer"/>
+    <w:lsdException w:qFormat="1" w:uiPriority="99" w:semiHidden="0" w:name="header"/>
+    <w:lsdException w:qFormat="1" w:uiPriority="99" w:semiHidden="0" w:name="footer"/>
     <w:lsdException w:uiPriority="99" w:name="index heading"/>
     <w:lsdException w:qFormat="1" w:uiPriority="35" w:name="caption"/>
     <w:lsdException w:uiPriority="99" w:name="table of figures"/>
@@ -1161,30 +1670,30 @@
     <w:lsdException w:uiPriority="99" w:name="endnote reference"/>
     <w:lsdException w:uiPriority="99" w:name="endnote text"/>
     <w:lsdException w:uiPriority="99" w:name="table of authorities"/>
-    <w:lsdException w:uiPriority="99" w:semiHidden="0" w:name="macro"/>
+    <w:lsdException w:qFormat="1" w:uiPriority="99" w:semiHidden="0" w:name="macro"/>
     <w:lsdException w:uiPriority="99" w:name="toa heading"/>
-    <w:lsdException w:uiPriority="99" w:semiHidden="0" w:name="List"/>
-    <w:lsdException w:uiPriority="99" w:semiHidden="0" w:name="List Bullet"/>
+    <w:lsdException w:qFormat="1" w:uiPriority="99" w:semiHidden="0" w:name="List"/>
+    <w:lsdException w:qFormat="1" w:uiPriority="99" w:semiHidden="0" w:name="List Bullet"/>
     <w:lsdException w:uiPriority="99" w:semiHidden="0" w:name="List Number"/>
     <w:lsdException w:uiPriority="99" w:semiHidden="0" w:name="List 2"/>
-    <w:lsdException w:uiPriority="99" w:semiHidden="0" w:name="List 3"/>
+    <w:lsdException w:qFormat="1" w:uiPriority="99" w:semiHidden="0" w:name="List 3"/>
     <w:lsdException w:uiPriority="99" w:name="List 4"/>
     <w:lsdException w:uiPriority="99" w:name="List 5"/>
-    <w:lsdException w:uiPriority="99" w:semiHidden="0" w:name="List Bullet 2"/>
-    <w:lsdException w:uiPriority="99" w:semiHidden="0" w:name="List Bullet 3"/>
+    <w:lsdException w:qFormat="1" w:uiPriority="99" w:semiHidden="0" w:name="List Bullet 2"/>
+    <w:lsdException w:qFormat="1" w:uiPriority="99" w:semiHidden="0" w:name="List Bullet 3"/>
     <w:lsdException w:uiPriority="99" w:name="List Bullet 4"/>
     <w:lsdException w:uiPriority="99" w:name="List Bullet 5"/>
-    <w:lsdException w:uiPriority="99" w:semiHidden="0" w:name="List Number 2"/>
-    <w:lsdException w:uiPriority="99" w:semiHidden="0" w:name="List Number 3"/>
+    <w:lsdException w:qFormat="1" w:uiPriority="99" w:semiHidden="0" w:name="List Number 2"/>
+    <w:lsdException w:qFormat="1" w:uiPriority="99" w:semiHidden="0" w:name="List Number 3"/>
     <w:lsdException w:uiPriority="99" w:name="List Number 4"/>
     <w:lsdException w:uiPriority="99" w:name="List Number 5"/>
     <w:lsdException w:qFormat="1" w:unhideWhenUsed="0" w:uiPriority="10" w:semiHidden="0" w:name="Title"/>
     <w:lsdException w:uiPriority="99" w:name="Closing"/>
     <w:lsdException w:uiPriority="99" w:name="Signature"/>
     <w:lsdException w:uiPriority="1" w:name="Default Paragraph Font"/>
-    <w:lsdException w:uiPriority="99" w:semiHidden="0" w:name="Body Text"/>
+    <w:lsdException w:qFormat="1" w:uiPriority="99" w:semiHidden="0" w:name="Body Text"/>
     <w:lsdException w:uiPriority="99" w:name="Body Text Indent"/>
-    <w:lsdException w:uiPriority="99" w:semiHidden="0" w:name="List Continue"/>
+    <w:lsdException w:qFormat="1" w:uiPriority="99" w:semiHidden="0" w:name="List Continue"/>
     <w:lsdException w:uiPriority="99" w:semiHidden="0" w:name="List Continue 2"/>
     <w:lsdException w:uiPriority="99" w:semiHidden="0" w:name="List Continue 3"/>
     <w:lsdException w:uiPriority="99" w:name="List Continue 4"/>
@@ -1197,7 +1706,7 @@
     <w:lsdException w:uiPriority="99" w:name="Body Text First Indent 2"/>
     <w:lsdException w:uiPriority="99" w:name="Note Heading"/>
     <w:lsdException w:qFormat="1" w:uiPriority="99" w:semiHidden="0" w:name="Body Text 2"/>
-    <w:lsdException w:uiPriority="99" w:semiHidden="0" w:name="Body Text 3"/>
+    <w:lsdException w:qFormat="1" w:uiPriority="99" w:semiHidden="0" w:name="Body Text 3"/>
     <w:lsdException w:uiPriority="99" w:name="Body Text Indent 2"/>
     <w:lsdException w:uiPriority="99" w:name="Body Text Indent 3"/>
     <w:lsdException w:uiPriority="99" w:name="Block Text"/>
@@ -1219,7 +1728,7 @@
     <w:lsdException w:uiPriority="99" w:name="HTML Sample"/>
     <w:lsdException w:uiPriority="99" w:name="HTML Typewriter"/>
     <w:lsdException w:uiPriority="99" w:name="HTML Variable"/>
-    <w:lsdException w:uiPriority="99" w:name="Normal Table"/>
+    <w:lsdException w:qFormat="1" w:uiPriority="99" w:name="Normal Table"/>
     <w:lsdException w:uiPriority="99" w:name="annotation subject"/>
     <w:lsdException w:uiPriority="99" w:name="Table Simple 1"/>
     <w:lsdException w:uiPriority="99" w:name="Table Simple 2"/>
@@ -1268,103 +1777,103 @@
     <w:lsdException w:uiPriority="99" w:name="Table Theme"/>
     <w:lsdException w:qFormat="1" w:unhideWhenUsed="0" w:uiPriority="1" w:semiHidden="0" w:name="No Spacing"/>
     <w:lsdException w:unhideWhenUsed="0" w:uiPriority="60" w:semiHidden="0" w:name="Light Shading"/>
-    <w:lsdException w:unhideWhenUsed="0" w:uiPriority="61" w:semiHidden="0" w:name="Light List"/>
+    <w:lsdException w:qFormat="1" w:unhideWhenUsed="0" w:uiPriority="61" w:semiHidden="0" w:name="Light List"/>
     <w:lsdException w:qFormat="1" w:unhideWhenUsed="0" w:uiPriority="62" w:semiHidden="0" w:name="Light Grid"/>
     <w:lsdException w:unhideWhenUsed="0" w:uiPriority="63" w:semiHidden="0" w:name="Medium Shading 1"/>
     <w:lsdException w:unhideWhenUsed="0" w:uiPriority="64" w:semiHidden="0" w:name="Medium Shading 2"/>
     <w:lsdException w:unhideWhenUsed="0" w:uiPriority="65" w:semiHidden="0" w:name="Medium List 1"/>
     <w:lsdException w:unhideWhenUsed="0" w:uiPriority="66" w:semiHidden="0" w:name="Medium List 2"/>
     <w:lsdException w:unhideWhenUsed="0" w:uiPriority="67" w:semiHidden="0" w:name="Medium Grid 1"/>
-    <w:lsdException w:unhideWhenUsed="0" w:uiPriority="68" w:semiHidden="0" w:name="Medium Grid 2"/>
+    <w:lsdException w:qFormat="1" w:unhideWhenUsed="0" w:uiPriority="68" w:semiHidden="0" w:name="Medium Grid 2"/>
     <w:lsdException w:unhideWhenUsed="0" w:uiPriority="69" w:semiHidden="0" w:name="Medium Grid 3"/>
-    <w:lsdException w:unhideWhenUsed="0" w:uiPriority="70" w:semiHidden="0" w:name="Dark List"/>
+    <w:lsdException w:qFormat="1" w:unhideWhenUsed="0" w:uiPriority="70" w:semiHidden="0" w:name="Dark List"/>
     <w:lsdException w:unhideWhenUsed="0" w:uiPriority="71" w:semiHidden="0" w:name="Colorful Shading"/>
     <w:lsdException w:unhideWhenUsed="0" w:uiPriority="72" w:semiHidden="0" w:name="Colorful List"/>
     <w:lsdException w:unhideWhenUsed="0" w:uiPriority="73" w:semiHidden="0" w:name="Colorful Grid"/>
     <w:lsdException w:unhideWhenUsed="0" w:uiPriority="60" w:semiHidden="0" w:name="Light Shading Accent 1"/>
     <w:lsdException w:unhideWhenUsed="0" w:uiPriority="61" w:semiHidden="0" w:name="Light List Accent 1"/>
-    <w:lsdException w:unhideWhenUsed="0" w:uiPriority="62" w:semiHidden="0" w:name="Light Grid Accent 1"/>
+    <w:lsdException w:qFormat="1" w:unhideWhenUsed="0" w:uiPriority="62" w:semiHidden="0" w:name="Light Grid Accent 1"/>
     <w:lsdException w:unhideWhenUsed="0" w:uiPriority="63" w:semiHidden="0" w:name="Medium Shading 1 Accent 1"/>
-    <w:lsdException w:unhideWhenUsed="0" w:uiPriority="64" w:semiHidden="0" w:name="Medium Shading 2 Accent 1"/>
-    <w:lsdException w:unhideWhenUsed="0" w:uiPriority="65" w:semiHidden="0" w:name="Medium List 1 Accent 1"/>
+    <w:lsdException w:qFormat="1" w:unhideWhenUsed="0" w:uiPriority="64" w:semiHidden="0" w:name="Medium Shading 2 Accent 1"/>
+    <w:lsdException w:qFormat="1" w:unhideWhenUsed="0" w:uiPriority="65" w:semiHidden="0" w:name="Medium List 1 Accent 1"/>
     <w:lsdException w:qFormat="1" w:unhideWhenUsed="0" w:uiPriority="34" w:semiHidden="0" w:name="List Paragraph"/>
     <w:lsdException w:qFormat="1" w:unhideWhenUsed="0" w:uiPriority="29" w:semiHidden="0" w:name="Quote"/>
     <w:lsdException w:qFormat="1" w:unhideWhenUsed="0" w:uiPriority="30" w:semiHidden="0" w:name="Intense Quote"/>
     <w:lsdException w:unhideWhenUsed="0" w:uiPriority="66" w:semiHidden="0" w:name="Medium List 2 Accent 1"/>
-    <w:lsdException w:unhideWhenUsed="0" w:uiPriority="67" w:semiHidden="0" w:name="Medium Grid 1 Accent 1"/>
+    <w:lsdException w:qFormat="1" w:unhideWhenUsed="0" w:uiPriority="67" w:semiHidden="0" w:name="Medium Grid 1 Accent 1"/>
     <w:lsdException w:unhideWhenUsed="0" w:uiPriority="68" w:semiHidden="0" w:name="Medium Grid 2 Accent 1"/>
-    <w:lsdException w:unhideWhenUsed="0" w:uiPriority="69" w:semiHidden="0" w:name="Medium Grid 3 Accent 1"/>
+    <w:lsdException w:qFormat="1" w:unhideWhenUsed="0" w:uiPriority="69" w:semiHidden="0" w:name="Medium Grid 3 Accent 1"/>
     <w:lsdException w:unhideWhenUsed="0" w:uiPriority="70" w:semiHidden="0" w:name="Dark List Accent 1"/>
-    <w:lsdException w:unhideWhenUsed="0" w:uiPriority="71" w:semiHidden="0" w:name="Colorful Shading Accent 1"/>
-    <w:lsdException w:unhideWhenUsed="0" w:uiPriority="72" w:semiHidden="0" w:name="Colorful List Accent 1"/>
+    <w:lsdException w:qFormat="1" w:unhideWhenUsed="0" w:uiPriority="71" w:semiHidden="0" w:name="Colorful Shading Accent 1"/>
+    <w:lsdException w:qFormat="1" w:unhideWhenUsed="0" w:uiPriority="72" w:semiHidden="0" w:name="Colorful List Accent 1"/>
     <w:lsdException w:unhideWhenUsed="0" w:uiPriority="73" w:semiHidden="0" w:name="Colorful Grid Accent 1"/>
-    <w:lsdException w:unhideWhenUsed="0" w:uiPriority="60" w:semiHidden="0" w:name="Light Shading Accent 2"/>
+    <w:lsdException w:qFormat="1" w:unhideWhenUsed="0" w:uiPriority="60" w:semiHidden="0" w:name="Light Shading Accent 2"/>
     <w:lsdException w:unhideWhenUsed="0" w:uiPriority="61" w:semiHidden="0" w:name="Light List Accent 2"/>
     <w:lsdException w:unhideWhenUsed="0" w:uiPriority="62" w:semiHidden="0" w:name="Light Grid Accent 2"/>
-    <w:lsdException w:unhideWhenUsed="0" w:uiPriority="63" w:semiHidden="0" w:name="Medium Shading 1 Accent 2"/>
+    <w:lsdException w:qFormat="1" w:unhideWhenUsed="0" w:uiPriority="63" w:semiHidden="0" w:name="Medium Shading 1 Accent 2"/>
     <w:lsdException w:unhideWhenUsed="0" w:uiPriority="64" w:semiHidden="0" w:name="Medium Shading 2 Accent 2"/>
     <w:lsdException w:unhideWhenUsed="0" w:uiPriority="65" w:semiHidden="0" w:name="Medium List 1 Accent 2"/>
     <w:lsdException w:unhideWhenUsed="0" w:uiPriority="66" w:semiHidden="0" w:name="Medium List 2 Accent 2"/>
     <w:lsdException w:unhideWhenUsed="0" w:uiPriority="67" w:semiHidden="0" w:name="Medium Grid 1 Accent 2"/>
-    <w:lsdException w:unhideWhenUsed="0" w:uiPriority="68" w:semiHidden="0" w:name="Medium Grid 2 Accent 2"/>
-    <w:lsdException w:unhideWhenUsed="0" w:uiPriority="69" w:semiHidden="0" w:name="Medium Grid 3 Accent 2"/>
+    <w:lsdException w:qFormat="1" w:unhideWhenUsed="0" w:uiPriority="68" w:semiHidden="0" w:name="Medium Grid 2 Accent 2"/>
+    <w:lsdException w:qFormat="1" w:unhideWhenUsed="0" w:uiPriority="69" w:semiHidden="0" w:name="Medium Grid 3 Accent 2"/>
     <w:lsdException w:unhideWhenUsed="0" w:uiPriority="70" w:semiHidden="0" w:name="Dark List Accent 2"/>
-    <w:lsdException w:unhideWhenUsed="0" w:uiPriority="71" w:semiHidden="0" w:name="Colorful Shading Accent 2"/>
-    <w:lsdException w:unhideWhenUsed="0" w:uiPriority="72" w:semiHidden="0" w:name="Colorful List Accent 2"/>
+    <w:lsdException w:qFormat="1" w:unhideWhenUsed="0" w:uiPriority="71" w:semiHidden="0" w:name="Colorful Shading Accent 2"/>
+    <w:lsdException w:qFormat="1" w:unhideWhenUsed="0" w:uiPriority="72" w:semiHidden="0" w:name="Colorful List Accent 2"/>
     <w:lsdException w:unhideWhenUsed="0" w:uiPriority="73" w:semiHidden="0" w:name="Colorful Grid Accent 2"/>
-    <w:lsdException w:unhideWhenUsed="0" w:uiPriority="60" w:semiHidden="0" w:name="Light Shading Accent 3"/>
+    <w:lsdException w:qFormat="1" w:unhideWhenUsed="0" w:uiPriority="60" w:semiHidden="0" w:name="Light Shading Accent 3"/>
     <w:lsdException w:unhideWhenUsed="0" w:uiPriority="61" w:semiHidden="0" w:name="Light List Accent 3"/>
-    <w:lsdException w:unhideWhenUsed="0" w:uiPriority="62" w:semiHidden="0" w:name="Light Grid Accent 3"/>
+    <w:lsdException w:qFormat="1" w:unhideWhenUsed="0" w:uiPriority="62" w:semiHidden="0" w:name="Light Grid Accent 3"/>
     <w:lsdException w:unhideWhenUsed="0" w:uiPriority="63" w:semiHidden="0" w:name="Medium Shading 1 Accent 3"/>
-    <w:lsdException w:unhideWhenUsed="0" w:uiPriority="64" w:semiHidden="0" w:name="Medium Shading 2 Accent 3"/>
+    <w:lsdException w:qFormat="1" w:unhideWhenUsed="0" w:uiPriority="64" w:semiHidden="0" w:name="Medium Shading 2 Accent 3"/>
     <w:lsdException w:qFormat="1" w:unhideWhenUsed="0" w:uiPriority="65" w:semiHidden="0" w:name="Medium List 1 Accent 3"/>
     <w:lsdException w:unhideWhenUsed="0" w:uiPriority="66" w:semiHidden="0" w:name="Medium List 2 Accent 3"/>
     <w:lsdException w:unhideWhenUsed="0" w:uiPriority="67" w:semiHidden="0" w:name="Medium Grid 1 Accent 3"/>
     <w:lsdException w:unhideWhenUsed="0" w:uiPriority="68" w:semiHidden="0" w:name="Medium Grid 2 Accent 3"/>
-    <w:lsdException w:unhideWhenUsed="0" w:uiPriority="69" w:semiHidden="0" w:name="Medium Grid 3 Accent 3"/>
+    <w:lsdException w:qFormat="1" w:unhideWhenUsed="0" w:uiPriority="69" w:semiHidden="0" w:name="Medium Grid 3 Accent 3"/>
     <w:lsdException w:unhideWhenUsed="0" w:uiPriority="70" w:semiHidden="0" w:name="Dark List Accent 3"/>
-    <w:lsdException w:unhideWhenUsed="0" w:uiPriority="71" w:semiHidden="0" w:name="Colorful Shading Accent 3"/>
+    <w:lsdException w:qFormat="1" w:unhideWhenUsed="0" w:uiPriority="71" w:semiHidden="0" w:name="Colorful Shading Accent 3"/>
     <w:lsdException w:unhideWhenUsed="0" w:uiPriority="72" w:semiHidden="0" w:name="Colorful List Accent 3"/>
     <w:lsdException w:unhideWhenUsed="0" w:uiPriority="73" w:semiHidden="0" w:name="Colorful Grid Accent 3"/>
     <w:lsdException w:unhideWhenUsed="0" w:uiPriority="60" w:semiHidden="0" w:name="Light Shading Accent 4"/>
     <w:lsdException w:qFormat="1" w:unhideWhenUsed="0" w:uiPriority="61" w:semiHidden="0" w:name="Light List Accent 4"/>
-    <w:lsdException w:unhideWhenUsed="0" w:uiPriority="62" w:semiHidden="0" w:name="Light Grid Accent 4"/>
+    <w:lsdException w:qFormat="1" w:unhideWhenUsed="0" w:uiPriority="62" w:semiHidden="0" w:name="Light Grid Accent 4"/>
     <w:lsdException w:unhideWhenUsed="0" w:uiPriority="63" w:semiHidden="0" w:name="Medium Shading 1 Accent 4"/>
     <w:lsdException w:unhideWhenUsed="0" w:uiPriority="64" w:semiHidden="0" w:name="Medium Shading 2 Accent 4"/>
-    <w:lsdException w:unhideWhenUsed="0" w:uiPriority="65" w:semiHidden="0" w:name="Medium List 1 Accent 4"/>
+    <w:lsdException w:qFormat="1" w:unhideWhenUsed="0" w:uiPriority="65" w:semiHidden="0" w:name="Medium List 1 Accent 4"/>
     <w:lsdException w:unhideWhenUsed="0" w:uiPriority="66" w:semiHidden="0" w:name="Medium List 2 Accent 4"/>
     <w:lsdException w:unhideWhenUsed="0" w:uiPriority="67" w:semiHidden="0" w:name="Medium Grid 1 Accent 4"/>
-    <w:lsdException w:unhideWhenUsed="0" w:uiPriority="68" w:semiHidden="0" w:name="Medium Grid 2 Accent 4"/>
+    <w:lsdException w:qFormat="1" w:unhideWhenUsed="0" w:uiPriority="68" w:semiHidden="0" w:name="Medium Grid 2 Accent 4"/>
     <w:lsdException w:unhideWhenUsed="0" w:uiPriority="69" w:semiHidden="0" w:name="Medium Grid 3 Accent 4"/>
-    <w:lsdException w:unhideWhenUsed="0" w:uiPriority="70" w:semiHidden="0" w:name="Dark List Accent 4"/>
+    <w:lsdException w:qFormat="1" w:unhideWhenUsed="0" w:uiPriority="70" w:semiHidden="0" w:name="Dark List Accent 4"/>
     <w:lsdException w:unhideWhenUsed="0" w:uiPriority="71" w:semiHidden="0" w:name="Colorful Shading Accent 4"/>
     <w:lsdException w:unhideWhenUsed="0" w:uiPriority="72" w:semiHidden="0" w:name="Colorful List Accent 4"/>
     <w:lsdException w:unhideWhenUsed="0" w:uiPriority="73" w:semiHidden="0" w:name="Colorful Grid Accent 4"/>
-    <w:lsdException w:unhideWhenUsed="0" w:uiPriority="60" w:semiHidden="0" w:name="Light Shading Accent 5"/>
-    <w:lsdException w:unhideWhenUsed="0" w:uiPriority="61" w:semiHidden="0" w:name="Light List Accent 5"/>
+    <w:lsdException w:qFormat="1" w:unhideWhenUsed="0" w:uiPriority="60" w:semiHidden="0" w:name="Light Shading Accent 5"/>
+    <w:lsdException w:qFormat="1" w:unhideWhenUsed="0" w:uiPriority="61" w:semiHidden="0" w:name="Light List Accent 5"/>
     <w:lsdException w:qFormat="1" w:unhideWhenUsed="0" w:uiPriority="62" w:semiHidden="0" w:name="Light Grid Accent 5"/>
     <w:lsdException w:unhideWhenUsed="0" w:uiPriority="63" w:semiHidden="0" w:name="Medium Shading 1 Accent 5"/>
-    <w:lsdException w:unhideWhenUsed="0" w:uiPriority="64" w:semiHidden="0" w:name="Medium Shading 2 Accent 5"/>
+    <w:lsdException w:qFormat="1" w:unhideWhenUsed="0" w:uiPriority="64" w:semiHidden="0" w:name="Medium Shading 2 Accent 5"/>
     <w:lsdException w:unhideWhenUsed="0" w:uiPriority="65" w:semiHidden="0" w:name="Medium List 1 Accent 5"/>
     <w:lsdException w:unhideWhenUsed="0" w:uiPriority="66" w:semiHidden="0" w:name="Medium List 2 Accent 5"/>
-    <w:lsdException w:unhideWhenUsed="0" w:uiPriority="67" w:semiHidden="0" w:name="Medium Grid 1 Accent 5"/>
+    <w:lsdException w:qFormat="1" w:unhideWhenUsed="0" w:uiPriority="67" w:semiHidden="0" w:name="Medium Grid 1 Accent 5"/>
     <w:lsdException w:unhideWhenUsed="0" w:uiPriority="68" w:semiHidden="0" w:name="Medium Grid 2 Accent 5"/>
-    <w:lsdException w:unhideWhenUsed="0" w:uiPriority="69" w:semiHidden="0" w:name="Medium Grid 3 Accent 5"/>
-    <w:lsdException w:unhideWhenUsed="0" w:uiPriority="70" w:semiHidden="0" w:name="Dark List Accent 5"/>
+    <w:lsdException w:qFormat="1" w:unhideWhenUsed="0" w:uiPriority="69" w:semiHidden="0" w:name="Medium Grid 3 Accent 5"/>
+    <w:lsdException w:qFormat="1" w:unhideWhenUsed="0" w:uiPriority="70" w:semiHidden="0" w:name="Dark List Accent 5"/>
     <w:lsdException w:unhideWhenUsed="0" w:uiPriority="71" w:semiHidden="0" w:name="Colorful Shading Accent 5"/>
     <w:lsdException w:unhideWhenUsed="0" w:uiPriority="72" w:semiHidden="0" w:name="Colorful List Accent 5"/>
     <w:lsdException w:unhideWhenUsed="0" w:uiPriority="73" w:semiHidden="0" w:name="Colorful Grid Accent 5"/>
     <w:lsdException w:unhideWhenUsed="0" w:uiPriority="60" w:semiHidden="0" w:name="Light Shading Accent 6"/>
-    <w:lsdException w:unhideWhenUsed="0" w:uiPriority="61" w:semiHidden="0" w:name="Light List Accent 6"/>
+    <w:lsdException w:qFormat="1" w:unhideWhenUsed="0" w:uiPriority="61" w:semiHidden="0" w:name="Light List Accent 6"/>
     <w:lsdException w:unhideWhenUsed="0" w:uiPriority="62" w:semiHidden="0" w:name="Light Grid Accent 6"/>
     <w:lsdException w:unhideWhenUsed="0" w:uiPriority="63" w:semiHidden="0" w:name="Medium Shading 1 Accent 6"/>
     <w:lsdException w:unhideWhenUsed="0" w:uiPriority="64" w:semiHidden="0" w:name="Medium Shading 2 Accent 6"/>
     <w:lsdException w:unhideWhenUsed="0" w:uiPriority="65" w:semiHidden="0" w:name="Medium List 1 Accent 6"/>
-    <w:lsdException w:unhideWhenUsed="0" w:uiPriority="66" w:semiHidden="0" w:name="Medium List 2 Accent 6"/>
+    <w:lsdException w:qFormat="1" w:unhideWhenUsed="0" w:uiPriority="66" w:semiHidden="0" w:name="Medium List 2 Accent 6"/>
     <w:lsdException w:unhideWhenUsed="0" w:uiPriority="67" w:semiHidden="0" w:name="Medium Grid 1 Accent 6"/>
     <w:lsdException w:unhideWhenUsed="0" w:uiPriority="68" w:semiHidden="0" w:name="Medium Grid 2 Accent 6"/>
     <w:lsdException w:unhideWhenUsed="0" w:uiPriority="69" w:semiHidden="0" w:name="Medium Grid 3 Accent 6"/>
-    <w:lsdException w:unhideWhenUsed="0" w:uiPriority="70" w:semiHidden="0" w:name="Dark List Accent 6"/>
+    <w:lsdException w:qFormat="1" w:unhideWhenUsed="0" w:uiPriority="70" w:semiHidden="0" w:name="Dark List Accent 6"/>
     <w:lsdException w:unhideWhenUsed="0" w:uiPriority="71" w:semiHidden="0" w:name="Colorful Shading Accent 6"/>
     <w:lsdException w:unhideWhenUsed="0" w:uiPriority="72" w:semiHidden="0" w:name="Colorful List Accent 6"/>
     <w:lsdException w:unhideWhenUsed="0" w:uiPriority="73" w:semiHidden="0" w:name="Colorful Grid Accent 6"/>
@@ -1624,6 +2133,7 @@
     <w:name w:val="Normal Table"/>
     <w:semiHidden/>
     <w:unhideWhenUsed/>
+    <w:qFormat/>
     <w:uiPriority w:val="99"/>
     <w:tblPr>
       <w:tblCellMar>
@@ -1638,6 +2148,7 @@
     <w:name w:val="macro"/>
     <w:link w:val="148"/>
     <w:unhideWhenUsed/>
+    <w:qFormat/>
     <w:uiPriority w:val="99"/>
     <w:pPr>
       <w:tabs>
@@ -1662,6 +2173,7 @@
     <w:name w:val="List 3"/>
     <w:basedOn w:val="1"/>
     <w:unhideWhenUsed/>
+    <w:qFormat/>
     <w:uiPriority w:val="99"/>
     <w:pPr>
       <w:ind w:left="1080" w:hanging="360"/>
@@ -1672,6 +2184,7 @@
     <w:name w:val="List Number 2"/>
     <w:basedOn w:val="1"/>
     <w:unhideWhenUsed/>
+    <w:qFormat/>
     <w:uiPriority w:val="99"/>
     <w:pPr>
       <w:numPr>
@@ -1722,6 +2235,7 @@
     <w:name w:val="List Bullet"/>
     <w:basedOn w:val="1"/>
     <w:unhideWhenUsed/>
+    <w:qFormat/>
     <w:uiPriority w:val="99"/>
     <w:pPr>
       <w:numPr>
@@ -1736,6 +2250,7 @@
     <w:basedOn w:val="1"/>
     <w:link w:val="147"/>
     <w:unhideWhenUsed/>
+    <w:qFormat/>
     <w:uiPriority w:val="99"/>
     <w:pPr>
       <w:spacing w:after="120"/>
@@ -1749,6 +2264,7 @@
     <w:name w:val="List Bullet 3"/>
     <w:basedOn w:val="1"/>
     <w:unhideWhenUsed/>
+    <w:qFormat/>
     <w:uiPriority w:val="99"/>
     <w:pPr>
       <w:numPr>
@@ -1763,6 +2279,7 @@
     <w:basedOn w:val="1"/>
     <w:link w:val="145"/>
     <w:unhideWhenUsed/>
+    <w:qFormat/>
     <w:uiPriority w:val="99"/>
     <w:pPr>
       <w:spacing w:after="120"/>
@@ -1772,6 +2289,7 @@
     <w:name w:val="List Number 3"/>
     <w:basedOn w:val="1"/>
     <w:unhideWhenUsed/>
+    <w:qFormat/>
     <w:uiPriority w:val="99"/>
     <w:pPr>
       <w:numPr>
@@ -1795,6 +2313,7 @@
     <w:name w:val="List Continue"/>
     <w:basedOn w:val="1"/>
     <w:unhideWhenUsed/>
+    <w:qFormat/>
     <w:uiPriority w:val="99"/>
     <w:pPr>
       <w:spacing w:after="120"/>
@@ -1806,6 +2325,7 @@
     <w:name w:val="List Bullet 2"/>
     <w:basedOn w:val="1"/>
     <w:unhideWhenUsed/>
+    <w:qFormat/>
     <w:uiPriority w:val="99"/>
     <w:pPr>
       <w:numPr>
@@ -1820,6 +2340,7 @@
     <w:basedOn w:val="1"/>
     <w:link w:val="137"/>
     <w:unhideWhenUsed/>
+    <w:qFormat/>
     <w:uiPriority w:val="99"/>
     <w:pPr>
       <w:tabs>
@@ -1834,6 +2355,7 @@
     <w:basedOn w:val="1"/>
     <w:link w:val="136"/>
     <w:unhideWhenUsed/>
+    <w:qFormat/>
     <w:uiPriority w:val="99"/>
     <w:pPr>
       <w:tabs>
@@ -1869,6 +2391,7 @@
     <w:name w:val="List"/>
     <w:basedOn w:val="1"/>
     <w:unhideWhenUsed/>
+    <w:qFormat/>
     <w:uiPriority w:val="99"/>
     <w:pPr>
       <w:ind w:left="360" w:hanging="360"/>
@@ -2156,6 +2679,7 @@
   <w:style w:type="table" w:styleId="36">
     <w:name w:val="Light Shading Accent 2"/>
     <w:basedOn w:val="32"/>
+    <w:qFormat/>
     <w:uiPriority w:val="60"/>
     <w:pPr>
       <w:spacing w:after="0" w:line="240" w:lineRule="auto"/>
@@ -2255,6 +2779,7 @@
   <w:style w:type="table" w:styleId="37">
     <w:name w:val="Light Shading Accent 3"/>
     <w:basedOn w:val="32"/>
+    <w:qFormat/>
     <w:uiPriority w:val="60"/>
     <w:pPr>
       <w:spacing w:after="0" w:line="240" w:lineRule="auto"/>
@@ -2453,6 +2978,7 @@
   <w:style w:type="table" w:styleId="39">
     <w:name w:val="Light Shading Accent 5"/>
     <w:basedOn w:val="32"/>
+    <w:qFormat/>
     <w:uiPriority w:val="60"/>
     <w:pPr>
       <w:spacing w:after="0" w:line="240" w:lineRule="auto"/>
@@ -2651,6 +3177,7 @@
   <w:style w:type="table" w:styleId="41">
     <w:name w:val="Light List"/>
     <w:basedOn w:val="32"/>
+    <w:qFormat/>
     <w:uiPriority w:val="61"/>
     <w:pPr>
       <w:spacing w:after="0" w:line="240" w:lineRule="auto"/>
@@ -3117,6 +3644,7 @@
   <w:style w:type="table" w:styleId="46">
     <w:name w:val="Light List Accent 5"/>
     <w:basedOn w:val="32"/>
+    <w:qFormat/>
     <w:uiPriority w:val="61"/>
     <w:pPr>
       <w:spacing w:after="0" w:line="240" w:lineRule="auto"/>
@@ -3210,6 +3738,7 @@
   <w:style w:type="table" w:styleId="47">
     <w:name w:val="Light List Accent 6"/>
     <w:basedOn w:val="32"/>
+    <w:qFormat/>
     <w:uiPriority w:val="61"/>
     <w:pPr>
       <w:spacing w:after="0" w:line="240" w:lineRule="auto"/>
@@ -3430,6 +3959,7 @@
   <w:style w:type="table" w:styleId="49">
     <w:name w:val="Light Grid Accent 1"/>
     <w:basedOn w:val="32"/>
+    <w:qFormat/>
     <w:uiPriority w:val="62"/>
     <w:pPr>
       <w:spacing w:after="0" w:line="240" w:lineRule="auto"/>
@@ -3682,6 +4212,7 @@
   <w:style w:type="table" w:styleId="51">
     <w:name w:val="Light Grid Accent 3"/>
     <w:basedOn w:val="32"/>
+    <w:qFormat/>
     <w:uiPriority w:val="62"/>
     <w:pPr>
       <w:spacing w:after="0" w:line="240" w:lineRule="auto"/>
@@ -3808,6 +4339,7 @@
   <w:style w:type="table" w:styleId="52">
     <w:name w:val="Light Grid Accent 4"/>
     <w:basedOn w:val="32"/>
+    <w:qFormat/>
     <w:uiPriority w:val="62"/>
     <w:pPr>
       <w:spacing w:after="0" w:line="240" w:lineRule="auto"/>
@@ -4401,6 +4933,7 @@
   <w:style w:type="table" w:styleId="57">
     <w:name w:val="Medium Shading 1 Accent 2"/>
     <w:basedOn w:val="32"/>
+    <w:qFormat/>
     <w:uiPriority w:val="63"/>
     <w:pPr>
       <w:spacing w:after="0" w:line="240" w:lineRule="auto"/>
@@ -5101,6 +5634,7 @@
   <w:style w:type="table" w:styleId="63">
     <w:name w:val="Medium Shading 2 Accent 1"/>
     <w:basedOn w:val="32"/>
+    <w:qFormat/>
     <w:uiPriority w:val="64"/>
     <w:pPr>
       <w:spacing w:after="0" w:line="240" w:lineRule="auto"/>
@@ -5431,6 +5965,7 @@
   <w:style w:type="table" w:styleId="65">
     <w:name w:val="Medium Shading 2 Accent 3"/>
     <w:basedOn w:val="32"/>
+    <w:qFormat/>
     <w:uiPriority w:val="64"/>
     <w:pPr>
       <w:spacing w:after="0" w:line="240" w:lineRule="auto"/>
@@ -5761,6 +6296,7 @@
   <w:style w:type="table" w:styleId="67">
     <w:name w:val="Medium Shading 2 Accent 5"/>
     <w:basedOn w:val="32"/>
+    <w:qFormat/>
     <w:uiPriority w:val="64"/>
     <w:pPr>
       <w:spacing w:after="0" w:line="240" w:lineRule="auto"/>
@@ -6181,6 +6717,7 @@
   <w:style w:type="table" w:styleId="70">
     <w:name w:val="Medium List 1 Accent 1"/>
     <w:basedOn w:val="32"/>
+    <w:qFormat/>
     <w:uiPriority w:val="65"/>
     <w:pPr>
       <w:spacing w:after="0" w:line="240" w:lineRule="auto"/>
@@ -6452,6 +6989,7 @@
   <w:style w:type="table" w:styleId="73">
     <w:name w:val="Medium List 1 Accent 4"/>
     <w:basedOn w:val="32"/>
+    <w:qFormat/>
     <w:uiPriority w:val="65"/>
     <w:pPr>
       <w:spacing w:after="0" w:line="240" w:lineRule="auto"/>
@@ -7496,6 +8034,7 @@
   <w:style w:type="table" w:styleId="82">
     <w:name w:val="Medium List 2 Accent 6"/>
     <w:basedOn w:val="32"/>
+    <w:qFormat/>
     <w:uiPriority w:val="66"/>
     <w:pPr>
       <w:spacing w:after="0" w:line="240" w:lineRule="auto"/>
@@ -7694,6 +8233,7 @@
   <w:style w:type="table" w:styleId="84">
     <w:name w:val="Medium Grid 1 Accent 1"/>
     <w:basedOn w:val="32"/>
+    <w:qFormat/>
     <w:uiPriority w:val="67"/>
     <w:pPr>
       <w:spacing w:after="0" w:line="240" w:lineRule="auto"/>
@@ -7970,6 +8510,7 @@
   <w:style w:type="table" w:styleId="88">
     <w:name w:val="Medium Grid 1 Accent 5"/>
     <w:basedOn w:val="32"/>
+    <w:qFormat/>
     <w:uiPriority w:val="67"/>
     <w:pPr>
       <w:spacing w:after="0" w:line="240" w:lineRule="auto"/>
@@ -8108,6 +8649,7 @@
   <w:style w:type="table" w:styleId="90">
     <w:name w:val="Medium Grid 2"/>
     <w:basedOn w:val="32"/>
+    <w:qFormat/>
     <w:uiPriority w:val="68"/>
     <w:pPr>
       <w:spacing w:after="0" w:line="240" w:lineRule="auto"/>
@@ -8400,6 +8942,7 @@
   <w:style w:type="table" w:styleId="92">
     <w:name w:val="Medium Grid 2 Accent 2"/>
     <w:basedOn w:val="32"/>
+    <w:qFormat/>
     <w:uiPriority w:val="68"/>
     <w:pPr>
       <w:spacing w:after="0" w:line="240" w:lineRule="auto"/>
@@ -8692,6 +9235,7 @@
   <w:style w:type="table" w:styleId="94">
     <w:name w:val="Medium Grid 2 Accent 4"/>
     <w:basedOn w:val="32"/>
+    <w:qFormat/>
     <w:uiPriority w:val="68"/>
     <w:pPr>
       <w:spacing w:after="0" w:line="240" w:lineRule="auto"/>
@@ -9287,6 +9831,7 @@
   <w:style w:type="table" w:styleId="98">
     <w:name w:val="Medium Grid 3 Accent 1"/>
     <w:basedOn w:val="32"/>
+    <w:qFormat/>
     <w:uiPriority w:val="69"/>
     <w:pPr>
       <w:spacing w:after="0" w:line="240" w:lineRule="auto"/>
@@ -9444,6 +9989,7 @@
   <w:style w:type="table" w:styleId="99">
     <w:name w:val="Medium Grid 3 Accent 2"/>
     <w:basedOn w:val="32"/>
+    <w:qFormat/>
     <w:uiPriority w:val="69"/>
     <w:pPr>
       <w:spacing w:after="0" w:line="240" w:lineRule="auto"/>
@@ -9601,6 +10147,7 @@
   <w:style w:type="table" w:styleId="100">
     <w:name w:val="Medium Grid 3 Accent 3"/>
     <w:basedOn w:val="32"/>
+    <w:qFormat/>
     <w:uiPriority w:val="69"/>
     <w:pPr>
       <w:spacing w:after="0" w:line="240" w:lineRule="auto"/>
@@ -9915,6 +10462,7 @@
   <w:style w:type="table" w:styleId="102">
     <w:name w:val="Medium Grid 3 Accent 5"/>
     <w:basedOn w:val="32"/>
+    <w:qFormat/>
     <w:uiPriority w:val="69"/>
     <w:pPr>
       <w:spacing w:after="0" w:line="240" w:lineRule="auto"/>
@@ -10229,6 +10777,7 @@
   <w:style w:type="table" w:styleId="104">
     <w:name w:val="Dark List"/>
     <w:basedOn w:val="32"/>
+    <w:qFormat/>
     <w:uiPriority w:val="70"/>
     <w:pPr>
       <w:spacing w:after="0" w:line="240" w:lineRule="auto"/>
@@ -10689,6 +11238,7 @@
   <w:style w:type="table" w:styleId="108">
     <w:name w:val="Dark List Accent 4"/>
     <w:basedOn w:val="32"/>
+    <w:qFormat/>
     <w:uiPriority w:val="70"/>
     <w:pPr>
       <w:spacing w:after="0" w:line="240" w:lineRule="auto"/>
@@ -10804,6 +11354,7 @@
   <w:style w:type="table" w:styleId="109">
     <w:name w:val="Dark List Accent 5"/>
     <w:basedOn w:val="32"/>
+    <w:qFormat/>
     <w:uiPriority w:val="70"/>
     <w:pPr>
       <w:spacing w:after="0" w:line="240" w:lineRule="auto"/>
@@ -10919,6 +11470,7 @@
   <w:style w:type="table" w:styleId="110">
     <w:name w:val="Dark List Accent 6"/>
     <w:basedOn w:val="32"/>
+    <w:qFormat/>
     <w:uiPriority w:val="70"/>
     <w:pPr>
       <w:spacing w:after="0" w:line="240" w:lineRule="auto"/>
@@ -11182,6 +11734,7 @@
   <w:style w:type="table" w:styleId="112">
     <w:name w:val="Colorful Shading Accent 1"/>
     <w:basedOn w:val="32"/>
+    <w:qFormat/>
     <w:uiPriority w:val="71"/>
     <w:pPr>
       <w:spacing w:after="0" w:line="240" w:lineRule="auto"/>
@@ -11330,6 +11883,7 @@
   <w:style w:type="table" w:styleId="113">
     <w:name w:val="Colorful Shading Accent 2"/>
     <w:basedOn w:val="32"/>
+    <w:qFormat/>
     <w:uiPriority w:val="71"/>
     <w:pPr>
       <w:spacing w:after="0" w:line="240" w:lineRule="auto"/>
@@ -11478,6 +12032,7 @@
   <w:style w:type="table" w:styleId="114">
     <w:name w:val="Colorful Shading Accent 3"/>
     <w:basedOn w:val="32"/>
+    <w:qFormat/>
     <w:uiPriority w:val="71"/>
     <w:pPr>
       <w:spacing w:after="0" w:line="240" w:lineRule="auto"/>
@@ -12142,6 +12697,7 @@
   <w:style w:type="table" w:styleId="119">
     <w:name w:val="Colorful List Accent 1"/>
     <w:basedOn w:val="32"/>
+    <w:qFormat/>
     <w:uiPriority w:val="72"/>
     <w:pPr>
       <w:spacing w:after="0" w:line="240" w:lineRule="auto"/>
@@ -12234,6 +12790,7 @@
   <w:style w:type="table" w:styleId="120">
     <w:name w:val="Colorful List Accent 2"/>
     <w:basedOn w:val="32"/>
+    <w:qFormat/>
     <w:uiPriority w:val="72"/>
     <w:pPr>
       <w:spacing w:after="0" w:line="240" w:lineRule="auto"/>

</xml_diff>